<commit_message>
build(cd): rebuild CĐ1/CĐ2 docx+pdf với prose tiếng Việt đã chuẩn hóa
Dựng lại deliverable cho hai chuyên đề sau khi chuẩn hóa thuật ngữ/văn phong ở
bản nguồn, để hồ sơ nộp CTU khớp với nội dung đã biên tập. Dùng pandoc 3.1.3 +
xelatex, template ctu_thesis_reference.docx. Đã xác minh CD2 docx chứa thuật
ngữ Việt mới (hiệu ứng tổng hợp, mức cơ sở, thiên lệch xuất bản, phương pháp
cắt và bù, dải biến thiên) và không còn jargon thô (pooled=0).

Cập nhật: dist/HO_SO_NOP/03_CHUYEN_DE/ (dossier nộp), dist/downloads/ (build
cache), dist/chuyen_de_1/ (bản sao). Gói đã ghép bìa
dist/submission_packages/cd2/CD2_submission_final.docx vẫn cần dựng lại bằng
quy trình đóng gói riêng (bìa chính + bìa phụ).

https://claude.ai/code/session_01TNqoRFY1vAVQL6GWg8X9M3
</commit_message>
<xml_diff>
--- a/dist/HO_SO_NOP/03_CHUYEN_DE/CD1_chuyen_de_1.docx
+++ b/dist/HO_SO_NOP/03_CHUYEN_DE/CD1_chuyen_de_1.docx
@@ -308,17 +308,17 @@
         <w:t xml:space="preserve"> </w:t>
       </w:r>
       <w:r>
-        <w:t xml:space="preserve">(innovation-driven so với resource-driven) và xác nhận pattern</w:t>
-      </w:r>
-      <w:r>
-        <w:t xml:space="preserve"> </w:t>
-      </w:r>
-      <w:r>
-        <w:rPr>
-          <w:bCs/>
-          <w:b/>
-        </w:rPr>
-        <w:t xml:space="preserve">gánh nặng quốc tế hóa bắt buộc (Forced Internationalization Penalty, FIP)</w:t>
+        <w:t xml:space="preserve">(innovation-driven so với resource-driven) và xác nhận</w:t>
+      </w:r>
+      <w:r>
+        <w:t xml:space="preserve"> </w:t>
+      </w:r>
+      <w:r>
+        <w:rPr>
+          <w:bCs/>
+          <w:b/>
+        </w:rPr>
+        <w:t xml:space="preserve">chi phí buộc phải quốc tế hóa (Forced Internationalization Penalty, FIP)</w:t>
       </w:r>
       <w:r>
         <w:t xml:space="preserve"> </w:t>
@@ -337,7 +337,7 @@
         <w:t xml:space="preserve">bản đồ địa hình xuất khẩu chiến lược (strategic export topography)</w:t>
       </w:r>
       <w:r>
-        <w:t xml:space="preserve">, trên đó chế độ thể chế ICRV vận hành như một bộ lọc chi phí giao dịch định vị nơi hiệu quả quốc tế hóa đạt đỉnh hay sụp đổ; phát hiện này đóng góp định hướng cho luận án và Chuyên đề tiến sĩ số 2.</w:t>
+        <w:t xml:space="preserve">. Trên bản đồ này, chế độ thể chế ICRV vận hành như một bộ lọc chi phí giao dịch, định vị nơi hiệu quả quốc tế hóa đạt đỉnh hay sụp đổ. Phát hiện này đóng góp định hướng cho luận án và Chuyên đề tiến sĩ số 2.</w:t>
       </w:r>
     </w:p>
     <w:p>
@@ -4003,7 +4003,7 @@
         <w:t xml:space="preserve">Lớp thứ sáu là xung đột Trung Đông 2026</w:t>
       </w:r>
       <w:r>
-        <w:t xml:space="preserve">, IMF (2026, tháng 4) điều chỉnh giảm tăng trưởng toàn cầu xuống 3,1% năm 2026; ADB (2026, tháng 4) dự báo Pacific 3,4%, Đông Nam Á 4,7%, Việt Nam 7,0%. Riêng Việt Nam, ADB (2026, tháng 4) ghi nhận GDP lịch sử 2025 đạt 8,0% và cập nhật dự báo 7,2% (2026) xuống 7,0% (2027).</w:t>
+        <w:t xml:space="preserve">. IMF (2026, tháng 4) điều chỉnh giảm tăng trưởng toàn cầu xuống 3,1% năm 2026; ADB (2026, tháng 4) dự báo Pacific 3,4%, Đông Nam Á 4,7%, Việt Nam 7,0%. Riêng Việt Nam, ADB (2026, tháng 4) ghi nhận GDP lịch sử 2025 đạt 8,0% và cập nhật dự báo 7,2% (2026) xuống 7,0% (2027).</w:t>
       </w:r>
       <w:r>
         <w:t xml:space="preserve"> </w:t>
@@ -4016,7 +4016,7 @@
         <w:t xml:space="preserve">Lớp thứ bảy là bất định chính sách thuế quan Mỹ 2026</w:t>
       </w:r>
       <w:r>
-        <w:t xml:space="preserve">, Mỹ chiếm xấp xỉ 30% tổng kim ngạch xuất khẩu Việt Nam; thuế toàn cầu 10% tạm thời tạo áp lực kép: hiệu ứng front-loading ngắn hạn và trì hoãn đầu tư dài hạn.</w:t>
+        <w:t xml:space="preserve">. Mỹ chiếm xấp xỉ 30% tổng kim ngạch xuất khẩu Việt Nam; thuế toàn cầu 10% tạm thời tạo áp lực kép: hiệu ứng dồn đơn hàng sớm (front-loading) ngắn hạn và trì hoãn đầu tư dài hạn.</w:t>
       </w:r>
     </w:p>
     <w:p>
@@ -5361,7 +5361,7 @@
         <w:t xml:space="preserve"> </w:t>
       </w:r>
       <w:r>
-        <w:t xml:space="preserve">giai đoạn 1980-2005. Hệ số tương quan trung bình r=0,045, tích cực nhưng nhỏ. Phát hiện chính: đo lường quốc tế hóa và hiệu quả rất không đồng nhất giữa các nghiên cứu, hạn chế khả năng so sánh. Khoảng trống: ít nghiên cứu châu Á mới nổi.</w:t>
+        <w:t xml:space="preserve">giai đoạn 1980-2005. Hệ số tương quan trung bình r=0,045, tích cực nhưng nhỏ. Phát hiện chính: đo lường quốc tế hóa và hiệu quả không đồng nhất đáng kể giữa các nghiên cứu, hạn chế khả năng so sánh. Khoảng trống: ít nghiên cứu châu Á mới nổi.</w:t>
       </w:r>
     </w:p>
     <w:p>
@@ -5434,7 +5434,7 @@
           <w:bCs/>
           <w:b/>
         </w:rPr>
-        <w:t xml:space="preserve">(5) Wu, Fan &amp; Chen (2022)</w:t>
+        <w:t xml:space="preserve">(5) Wu et al. (2022)</w:t>
       </w:r>
       <w:r>
         <w:t xml:space="preserve">: Cập nhật meta-analysis đến 2020, tập trung vào</w:t>
@@ -6885,7 +6885,7 @@
               <w:t xml:space="preserve">Nhóm V, Cận biên (Frontier)</w:t>
             </w:r>
             <w:r>
-              <w:t xml:space="preserve">: WGI Rule of Law &lt; -0,50; GNI bình quân đầu người &lt;1.000 hoặc &lt;3.000 USD với voids thể chế lớn; nhiều nước đang qua giai đoạn xung đột hoặc chuyển đổi sau xung đột. Pattern WBES: phân tán năng suất cao nhất (độ lệch chuẩn log 1,36), R&amp;D thấp nhất, nhưng đổi mới sản phẩm cao (đổi mới bằng nguồn lực hạn chế).</w:t>
+              <w:t xml:space="preserve">: WGI Rule of Law &lt; -0,50; GNI bình quân đầu người &lt;1.000 hoặc &lt;3.000 USD với khoảng trống thể chế (institutional voids) lớn; nhiều nước đang qua giai đoạn xung đột hoặc chuyển đổi sau xung đột. Pattern WBES: phân tán năng suất cao nhất (độ lệch chuẩn log 1,36), R&amp;D thấp nhất, nhưng đổi mới sản phẩm cao (đổi mới bằng nguồn lực hạn chế).</w:t>
             </w:r>
           </w:p>
         </w:tc>
@@ -7254,7 +7254,7 @@
               <w:t xml:space="preserve"> </w:t>
             </w:r>
             <w:r>
-              <w:t xml:space="preserve">| V, Frontier | &lt;-0,50 | &lt;$1k–$3k | Tự cấp + phi chính thức | Thấp-trung bình | ~1,36 | Yếu; voids thể chế dẫn đến đổi mới bằng nguồn lực hạn chế |</w:t>
+              <w:t xml:space="preserve">| V, Frontier | &lt;-0,50 | &lt;$1k–$3k | Tự cấp + phi chính thức | Thấp-trung bình | ~1,36 | Yếu; khoảng trống thể chế dẫn đến đổi mới bằng nguồn lực hạn chế |</w:t>
             </w:r>
             <w:r>
               <w:t xml:space="preserve"> </w:t>
@@ -10385,7 +10385,7 @@
               <w:jc w:val="left"/>
             </w:pPr>
             <w:r>
-              <w:t xml:space="preserve">Khanna &amp; Palepu (2010), voids thể chế</w:t>
+              <w:t xml:space="preserve">Khanna &amp; Palepu (2010), khoảng trống thể chế</w:t>
             </w:r>
           </w:p>
         </w:tc>
@@ -10714,7 +10714,7 @@
         <w:t xml:space="preserve">power_outage_intensity</w:t>
       </w:r>
       <w:r>
-        <w:t xml:space="preserve">. Sự hiện diện đồng thời của nhiều voids thể chế tại Frontier giải thích tại sao quan hệ quốc tế hóa - hiệu quả ở nhóm này yếu và không đơn điệu.</w:t>
+        <w:t xml:space="preserve">. Sự hiện diện đồng thời của nhiều khoảng trống thể chế tại Frontier giải thích tại sao quan hệ quốc tế hóa - hiệu quả ở nhóm này yếu và không đơn điệu.</w:t>
       </w:r>
     </w:p>
     <w:p>
@@ -12299,7 +12299,7 @@
         <w:pStyle w:val="BodyText"/>
       </w:pPr>
       <w:r>
-        <w:t xml:space="preserve">Kafouros et al. (2023) chứng minh chất lượng thể chế tương tác hai chiều với dynamism ngành: ở ngành dynamism công nghệ cao, thể chế tốt khuếch đại hiệu quả; ở ngành dynamism thị trường cao, thể chế tốt có thể làm yếu hiệu quả (doanh nghiệp phải nội bộ hóa chức năng). Phát hiện này gợi ý hướng kiểm định cho Chuyên đề 2.</w:t>
+        <w:t xml:space="preserve">Kafouros et al. (2023) cho thấy chất lượng thể chế tương tác hai chiều với dynamism ngành: ở ngành dynamism công nghệ cao, thể chế tốt khuếch đại hiệu quả; ở ngành dynamism thị trường cao, thể chế tốt có thể làm yếu hiệu quả (doanh nghiệp phải nội bộ hóa chức năng). Phát hiện này gợi ý hướng kiểm định cho Chuyên đề 2.</w:t>
       </w:r>
     </w:p>
     <w:bookmarkEnd w:id="54"/>
@@ -15740,7 +15740,7 @@
         <w:t xml:space="preserve">7,2% (2026) / 7,0% (2027)</w:t>
       </w:r>
       <w:r>
-        <w:t xml:space="preserve">, vượt ASEAN 4,6%. Bốn động lực: (a) cam kết FDI 2,4 tỷ USD với 18 dự án chiến lược; (b) năng suất lao động +5,1% trong giai đoạn 2026-2027; (c) khoản vay ADB dựa trên chính sách 2,4 tỷ USD nhắm mục tiêu SME nội địa; (d) tái định vị trong chuỗi giá trị toàn cầu từ lắp ráp downstream sang thiết kế và R&amp;D mid-stream.</w:t>
+        <w:t xml:space="preserve">, vượt ASEAN 4,6%. Bốn động lực: (a) cam kết FDI 2,4 tỷ USD với 18 dự án chiến lược; (b) năng suất lao động +5,1% trong giai đoạn 2026-2027; (c) khoản vay ADB dựa trên chính sách 2,4 tỷ USD nhắm mục tiêu SME nội địa; (d) tái định vị trong chuỗi giá trị toàn cầu từ lắp ráp hạ nguồn (downstream) sang thiết kế và R&amp;D trung nguồn (mid-stream).</w:t>
       </w:r>
     </w:p>
     <w:p>
@@ -15789,7 +15789,7 @@
         <w:t xml:space="preserve">Rủi ro tập trung</w:t>
       </w:r>
       <w:r>
-        <w:t xml:space="preserve">: Wang, Huang và Hong (2024, IRFA) phân tích 80% mô hình rủi ro ngân hàng tại Trung Quốc phụ thuộc các nhà cung cấp công nghệ chi phối thị trường, cảnh báo cho lộ trình sản xuất thông minh.</w:t>
+        <w:t xml:space="preserve">: Wang et al. (2024, IRFA) phân tích 80% mô hình rủi ro ngân hàng tại Trung Quốc phụ thuộc các nhà cung cấp công nghệ chi phối thị trường, cảnh báo cho lộ trình sản xuất thông minh.</w:t>
       </w:r>
     </w:p>
     <w:bookmarkEnd w:id="61"/>
@@ -17395,7 +17395,7 @@
         <w:pStyle w:val="BodyText"/>
       </w:pPr>
       <w:r>
-        <w:t xml:space="preserve">Sáu phát hiện chính: (1) FDI dương mạnh ở SIDS (+0,222), FDI ngoại sinh là nguồn năng suất chủ đạo; (2) FDI âm tại Advanced (−0,113), doanh nghiệp FDI không có lợi thế tại thị trường trưởng thành; (3) FSTS dương tại Advanced (+0,113), xác nhận lý thuyết Uppsala; (4) TCI dương đồng đều SIDS và Advanced; (5) DAI âm tại Advanced (−0,129), Nghịch lý bão hòa số; (6) Đảo dấu cross-regime, thể chế điều tiết chiều hướng cơ chế (Xu, 2024).</w:t>
+        <w:t xml:space="preserve">Sáu phát hiện chính: (1) FDI dương mạnh ở SIDS (+0,222), FDI ngoại sinh là nguồn năng suất chủ đạo; (2) FDI âm tại Advanced (−0,113), doanh nghiệp FDI không có lợi thế tại thị trường trưởng thành; (3) FSTS dương tại Advanced (+0,113), xác nhận lý thuyết Uppsala; (4) TCI dương đồng đều SIDS và Advanced; (5) DAI âm tại Advanced (−0,129), Nghịch lý bão hòa số; (6) Đảo dấu xuyên chế độ thể chế (cross-regime), thể chế điều tiết chiều hướng cơ chế (Xu, 2024).</w:t>
       </w:r>
     </w:p>
     <w:p>
@@ -17844,7 +17844,7 @@
         <w:pStyle w:val="BodyText"/>
       </w:pPr>
       <w:r>
-        <w:t xml:space="preserve">Bốn quan sát: (a) EAP paradox, quản lý dẫn đầu toàn cầu nhưng ownership ceiling thấp hơn management ceiling 7,7 điểm; (b) MENA bottleneck, rào cản thể chế kép trong bối cảnh nhà nước tô (Beblawi, 1987); (c) 43/50 nền kinh tế có tỷ lệ nữ trong nhóm quản trị cấp cao cao hơn nữ sở hữu đa số; (d) hàm ý cho Chuyên đề 2: tương tác giới tính × FSTS dương tại Emerging qua kênh quan hệ (Hambrick &amp; Mason, 1984) nhưng không có ý nghĩa thống kê tại Advanced.</w:t>
+        <w:t xml:space="preserve">Bốn quan sát: (a) nghịch lý EAP, nữ quản lý dẫn đầu toàn cầu nhưng trần sở hữu (ownership ceiling) thấp hơn trần quản lý (management ceiling) 7,7 điểm; (b) điểm nghẽn MENA (bottleneck), rào cản thể chế kép trong bối cảnh nhà nước tô (Beblawi, 1987); (c) 43/50 nền kinh tế có tỷ lệ nữ trong nhóm quản trị cấp cao cao hơn nữ sở hữu đa số; (d) hàm ý cho Chuyên đề 2: tương tác giới tính × FSTS dương tại Emerging qua kênh quan hệ (Hambrick &amp; Mason, 1984) nhưng không có ý nghĩa thống kê tại Advanced.</w:t>
       </w:r>
     </w:p>
     <w:bookmarkEnd w:id="68"/>
@@ -18592,7 +18592,7 @@
         <w:t xml:space="preserve">(5) Bối cảnh thể chế là tầng điều kiện, không phải yếu tố nền</w:t>
       </w:r>
       <w:r>
-        <w:t xml:space="preserve">: Đảo dấu cross-regime không phải nhiễu mà là tín hiệu lý thuyết. Nghiên cứu kinh doanh quốc tế tương lai nên kiểm định hiệu ứng điều tiết theo nhóm ICRV trước khi báo cáo kích thước hiệu ứng trung bình.</w:t>
+        <w:t xml:space="preserve">: Đảo dấu xuyên chế độ thể chế không phải nhiễu mà là tín hiệu lý thuyết. Nghiên cứu kinh doanh quốc tế tương lai nên kiểm định hiệu ứng điều tiết theo nhóm ICRV trước khi báo cáo kích thước hiệu ứng trung bình.</w:t>
       </w:r>
     </w:p>
     <w:bookmarkEnd w:id="73"/>
@@ -18647,7 +18647,7 @@
         <w:t xml:space="preserve">(3) Winsorize trong cụm quốc gia × năm tốt hơn winsorize tổng thể</w:t>
       </w:r>
       <w:r>
-        <w:t xml:space="preserve">: Winsorize tổng thể bóp méo phân phối tại Frontier (độ lệch chuẩn log 2,18+). Winsorize trong cụm bảo tồn dị biệt cross-regime quan trọng về lý thuyết.</w:t>
+        <w:t xml:space="preserve">: Winsorize tổng thể bóp méo phân phối tại Frontier (độ lệch chuẩn log 2,18+). Winsorize trong cụm bảo tồn dị biệt xuyên chế độ thể chế quan trọng về lý thuyết.</w:t>
       </w:r>
     </w:p>
     <w:p>
@@ -18659,7 +18659,7 @@
           <w:bCs/>
           <w:b/>
         </w:rPr>
-        <w:t xml:space="preserve">(4) HC1 robust SE như chuẩn mực cho hồi quy đa quốc gia WBES</w:t>
+        <w:t xml:space="preserve">(4) Sai số chuẩn vững HC1 (robust SE) như chuẩn mực cho hồi quy đa quốc gia WBES</w:t>
       </w:r>
       <w:r>
         <w:t xml:space="preserve">: HC3 cần thiết cho mẫu con nhỏ (SIDS n &lt; 200). HC1 là cân bằng tốt giữa hiệu suất ước lượng và độ bền vững cho mẫu đầy đủ.</w:t>
@@ -18773,7 +18773,7 @@
         <w:t xml:space="preserve">KL4, Thể chế là biến điều tiết, không phải biến trung gian</w:t>
       </w:r>
       <w:r>
-        <w:t xml:space="preserve">: Gap de jure-de facto (Xu, 2024) giải thích đảo dấu FDI cross-regime. Chính sách nâng cao thể chế hiệu quả nhất khi song hành với nâng cấp TCI và DAI.</w:t>
+        <w:t xml:space="preserve">: Gap de jure-de facto (Xu, 2024) giải thích đảo dấu FDI xuyên chế độ thể chế. Chính sách nâng cao thể chế hiệu quả nhất khi song hành với nâng cấp TCI và DAI.</w:t>
       </w:r>
     </w:p>
     <w:p>
@@ -18803,7 +18803,7 @@
         <w:t xml:space="preserve">KL6, EAP dẫn đầu toàn cầu về nữ quản lý cấp cao (33,4%) nhưng khoảng cách sở hữu dai dẳng</w:t>
       </w:r>
       <w:r>
-        <w:t xml:space="preserve">: Trần kính ở lớp sở hữu chưa được phá vỡ dù management ceiling đang thu hẹp.</w:t>
+        <w:t xml:space="preserve">: Trần kính ở lớp sở hữu chưa được phá vỡ dù trần quản lý đang thu hẹp.</w:t>
       </w:r>
     </w:p>
     <w:p>
@@ -18882,7 +18882,7 @@
           <w:bCs/>
           <w:b/>
         </w:rPr>
-        <w:t xml:space="preserve">(1) Sequencing năng lực trước, nâng cấp TCI trước khi mở rộng FSTS</w:t>
+        <w:t xml:space="preserve">(1) Tuần tự hóa năng lực (sequencing) trước, nâng cấp TCI trước khi mở rộng FSTS</w:t>
       </w:r>
       <w:r>
         <w:t xml:space="preserve">: Hệ số TCI = 0,179 (nhân quả ước lượng biến công cụ, nghiên cứu Việt Nam) xác nhận: xuất khẩu chỉ tạo năng suất khi doanh nghiệp có năng lực công nghệ nền tảng. Chương trình hỗ trợ xuất khẩu cần song hành với nâng cấp TCI.</w:t>
@@ -18927,10 +18927,10 @@
           <w:bCs/>
           <w:b/>
         </w:rPr>
-        <w:t xml:space="preserve">(4) Tái định vị chuỗi giá trị toàn cầu: lắp ráp downstream sang thiết kế và R&amp;D mid-stream</w:t>
-      </w:r>
-      <w:r>
-        <w:t xml:space="preserve">: Việt Nam ở điểm uốn (39-46%). Trung Quốc R&amp;D 39,4% và điểm uốn cao hơn (47-49%) cho thấy: Sự chênh lệch điểm uốn giữa Trung Quốc (TP ~47-49%, Nhóm III) và Việt Nam (TP ~39-46%, Nhóm IV) phản ánh gradient ICRV, không phải gradient TCI. TCI nâng mặt bằng năng suất ở mọi mức FSTS (hiệu ứng level-shift) nhưng không trực tiếp quyết định vị trí điểm uốn, phân biệt hai cơ chế này là quan trọng cho hàm ý chính sách.</w:t>
+        <w:t xml:space="preserve">(4) Tái định vị chuỗi giá trị toàn cầu: lắp ráp hạ nguồn sang thiết kế và R&amp;D trung nguồn</w:t>
+      </w:r>
+      <w:r>
+        <w:t xml:space="preserve">: Việt Nam ở điểm uốn (39-46%). Trung Quốc R&amp;D 39,4% và điểm uốn cao hơn (47-49%) cho thấy: Sự chênh lệch điểm uốn giữa Trung Quốc (TP ~47-49%, Nhóm III) và Việt Nam (TP ~39-46%, Nhóm IV) phản ánh dải biến thiên (gradient) theo ICRV, không phải dải biến thiên theo TCI. TCI nâng mặt bằng năng suất ở mọi mức FSTS (hiệu ứng dịch chuyển mức, level-shift) nhưng không trực tiếp quyết định vị trí điểm uốn. Phân biệt hai cơ chế này có ý nghĩa cho hàm ý chính sách.</w:t>
       </w:r>
     </w:p>
     <w:p>
@@ -19181,7 +19181,7 @@
         <w:t xml:space="preserve">(2) Lọc mẫu</w:t>
       </w:r>
       <w:r>
-        <w:t xml:space="preserve">: Loại micro firms (&lt; 5 lao động) và doanh nghiệp nhà nước. Kết quả cần bền vững trong SME tư nhân (n</w:t>
+        <w:t xml:space="preserve">: Loại doanh nghiệp siêu nhỏ (micro firms, &lt; 5 lao động) và doanh nghiệp nhà nước. Kết quả cần bền vững trong SME tư nhân (n</w:t>
       </w:r>
       <w:r>
         <w:t xml:space="preserve"> </w:t>
@@ -19240,7 +19240,7 @@
           <w:bCs/>
           <w:b/>
         </w:rPr>
-        <w:t xml:space="preserve">(5) Placebo tests</w:t>
+        <w:t xml:space="preserve">(5) Kiểm định giả dược (placebo tests)</w:t>
       </w:r>
       <w:r>
         <w:t xml:space="preserve">: Thay FSTS + TCI bằng biến nhiễu. Kết quả chính không được có ý nghĩa thống kê.</w:t>

</xml_diff>